<commit_message>
docs: actualizar ayudas y manual operativo
</commit_message>
<xml_diff>
--- a/docs/Manual_operativo_TradingCore_PowerShell_Git_Copilot.docx
+++ b/docs/Manual_operativo_TradingCore_PowerShell_Git_Copilot.docx
@@ -49,10 +49,7 @@
         <w:jc w:val="center"/>
       </w:pPr>
       <w:r>
-        <w:rPr>
-          <w:i/>
-        </w:rPr>
-        <w:t>Última actualización: 15/09/2026</w:t>
+        <w:t>Última actualización: 18/09/2026</w:t>
       </w:r>
     </w:p>
     <w:p>
@@ -96,10 +93,6 @@
         <w:gridCol w:w="9144"/>
       </w:tblGrid>
       <w:tr>
-        <w:trPr>
-          <w:tblHeader w:val="true"/>
-          <w:cantSplit/>
-        </w:trPr>
         <w:tc>
           <w:tcPr>
             <w:tcW w:type="dxa" w:w="9936"/>
@@ -164,7 +157,7 @@
         <w:spacing w:after="60"/>
       </w:pPr>
       <w:r>
-        <w:t>3. Hacer una modificación pequeña y concreta, manualmente o mediante Copilot.</w:t>
+        <w:t>3. Hacer una modificación pequeña y concreta. Usar Copilot principalmente para escritura de código; documentación y ajustes puntuales pueden editarse directamente cuando sea más eficiente.</w:t>
       </w:r>
     </w:p>
     <w:p>
@@ -209,7 +202,7 @@
         <w:spacing w:after="60"/>
       </w:pPr>
       <w:r>
-        <w:t>8. Realizar una prueba funcional sobre la instancia realmente reiniciada.</w:t>
+        <w:t>8. Realizar una prueba funcional sobre una única instancia realmente reiniciada; en cambios web, comprobar antes los procesos que escuchan en el puerto 5000.</w:t>
       </w:r>
     </w:p>
     <w:p>
@@ -244,10 +237,6 @@
         <w:gridCol w:w="2484"/>
       </w:tblGrid>
       <w:tr>
-        <w:trPr>
-          <w:tblHeader w:val="true"/>
-          <w:cantSplit/>
-        </w:trPr>
         <w:tc>
           <w:tcPr>
             <w:tcW w:type="dxa" w:w="1368"/>
@@ -354,9 +343,6 @@
         </w:tc>
       </w:tr>
       <w:tr>
-        <w:trPr>
-          <w:cantSplit/>
-        </w:trPr>
         <w:tc>
           <w:tcPr>
             <w:tcW w:type="dxa" w:w="1368"/>
@@ -452,9 +438,6 @@
         </w:tc>
       </w:tr>
       <w:tr>
-        <w:trPr>
-          <w:cantSplit/>
-        </w:trPr>
         <w:tc>
           <w:tcPr>
             <w:tcW w:type="dxa" w:w="1368"/>
@@ -550,9 +533,6 @@
         </w:tc>
       </w:tr>
       <w:tr>
-        <w:trPr>
-          <w:cantSplit/>
-        </w:trPr>
         <w:tc>
           <w:tcPr>
             <w:tcW w:type="dxa" w:w="1368"/>
@@ -648,9 +628,6 @@
         </w:tc>
       </w:tr>
       <w:tr>
-        <w:trPr>
-          <w:cantSplit/>
-        </w:trPr>
         <w:tc>
           <w:tcPr>
             <w:tcW w:type="dxa" w:w="1368"/>
@@ -746,9 +723,6 @@
         </w:tc>
       </w:tr>
       <w:tr>
-        <w:trPr>
-          <w:cantSplit/>
-        </w:trPr>
         <w:tc>
           <w:tcPr>
             <w:tcW w:type="dxa" w:w="1368"/>
@@ -844,9 +818,6 @@
         </w:tc>
       </w:tr>
       <w:tr>
-        <w:trPr>
-          <w:cantSplit/>
-        </w:trPr>
         <w:tc>
           <w:tcPr>
             <w:tcW w:type="dxa" w:w="1368"/>
@@ -958,10 +929,6 @@
         <w:gridCol w:w="9144"/>
       </w:tblGrid>
       <w:tr>
-        <w:trPr>
-          <w:tblHeader w:val="true"/>
-          <w:cantSplit/>
-        </w:trPr>
         <w:tc>
           <w:tcPr>
             <w:tcW w:type="dxa" w:w="9936"/>
@@ -1016,10 +983,6 @@
         <w:gridCol w:w="2484"/>
       </w:tblGrid>
       <w:tr>
-        <w:trPr>
-          <w:tblHeader w:val="true"/>
-          <w:cantSplit/>
-        </w:trPr>
         <w:tc>
           <w:tcPr>
             <w:tcW w:type="dxa" w:w="1368"/>
@@ -1126,9 +1089,6 @@
         </w:tc>
       </w:tr>
       <w:tr>
-        <w:trPr>
-          <w:cantSplit/>
-        </w:trPr>
         <w:tc>
           <w:tcPr>
             <w:tcW w:type="dxa" w:w="1368"/>
@@ -1224,9 +1184,6 @@
         </w:tc>
       </w:tr>
       <w:tr>
-        <w:trPr>
-          <w:cantSplit/>
-        </w:trPr>
         <w:tc>
           <w:tcPr>
             <w:tcW w:type="dxa" w:w="1368"/>
@@ -1322,9 +1279,6 @@
         </w:tc>
       </w:tr>
       <w:tr>
-        <w:trPr>
-          <w:cantSplit/>
-        </w:trPr>
         <w:tc>
           <w:tcPr>
             <w:tcW w:type="dxa" w:w="1368"/>
@@ -1420,9 +1374,6 @@
         </w:tc>
       </w:tr>
       <w:tr>
-        <w:trPr>
-          <w:cantSplit/>
-        </w:trPr>
         <w:tc>
           <w:tcPr>
             <w:tcW w:type="dxa" w:w="1368"/>
@@ -1518,9 +1469,6 @@
         </w:tc>
       </w:tr>
       <w:tr>
-        <w:trPr>
-          <w:cantSplit/>
-        </w:trPr>
         <w:tc>
           <w:tcPr>
             <w:tcW w:type="dxa" w:w="1368"/>
@@ -1616,9 +1564,6 @@
         </w:tc>
       </w:tr>
       <w:tr>
-        <w:trPr>
-          <w:cantSplit/>
-        </w:trPr>
         <w:tc>
           <w:tcPr>
             <w:tcW w:type="dxa" w:w="1368"/>
@@ -1714,9 +1659,6 @@
         </w:tc>
       </w:tr>
       <w:tr>
-        <w:trPr>
-          <w:cantSplit/>
-        </w:trPr>
         <w:tc>
           <w:tcPr>
             <w:tcW w:type="dxa" w:w="1368"/>
@@ -1840,10 +1782,6 @@
         <w:gridCol w:w="2484"/>
       </w:tblGrid>
       <w:tr>
-        <w:trPr>
-          <w:tblHeader w:val="true"/>
-          <w:cantSplit/>
-        </w:trPr>
         <w:tc>
           <w:tcPr>
             <w:tcW w:type="dxa" w:w="1368"/>
@@ -1950,9 +1888,6 @@
         </w:tc>
       </w:tr>
       <w:tr>
-        <w:trPr>
-          <w:cantSplit/>
-        </w:trPr>
         <w:tc>
           <w:tcPr>
             <w:tcW w:type="dxa" w:w="1368"/>
@@ -2048,9 +1983,6 @@
         </w:tc>
       </w:tr>
       <w:tr>
-        <w:trPr>
-          <w:cantSplit/>
-        </w:trPr>
         <w:tc>
           <w:tcPr>
             <w:tcW w:type="dxa" w:w="1368"/>
@@ -2146,9 +2078,6 @@
         </w:tc>
       </w:tr>
       <w:tr>
-        <w:trPr>
-          <w:cantSplit/>
-        </w:trPr>
         <w:tc>
           <w:tcPr>
             <w:tcW w:type="dxa" w:w="1368"/>
@@ -2244,9 +2173,6 @@
         </w:tc>
       </w:tr>
       <w:tr>
-        <w:trPr>
-          <w:cantSplit/>
-        </w:trPr>
         <w:tc>
           <w:tcPr>
             <w:tcW w:type="dxa" w:w="1368"/>
@@ -2342,9 +2268,6 @@
         </w:tc>
       </w:tr>
       <w:tr>
-        <w:trPr>
-          <w:cantSplit/>
-        </w:trPr>
         <w:tc>
           <w:tcPr>
             <w:tcW w:type="dxa" w:w="1368"/>
@@ -2440,9 +2363,6 @@
         </w:tc>
       </w:tr>
       <w:tr>
-        <w:trPr>
-          <w:cantSplit/>
-        </w:trPr>
         <w:tc>
           <w:tcPr>
             <w:tcW w:type="dxa" w:w="1368"/>
@@ -2554,10 +2474,6 @@
         <w:gridCol w:w="9144"/>
       </w:tblGrid>
       <w:tr>
-        <w:trPr>
-          <w:tblHeader w:val="true"/>
-          <w:cantSplit/>
-        </w:trPr>
         <w:tc>
           <w:tcPr>
             <w:tcW w:type="dxa" w:w="9936"/>
@@ -2617,10 +2533,6 @@
         <w:gridCol w:w="2484"/>
       </w:tblGrid>
       <w:tr>
-        <w:trPr>
-          <w:tblHeader w:val="true"/>
-          <w:cantSplit/>
-        </w:trPr>
         <w:tc>
           <w:tcPr>
             <w:tcW w:type="dxa" w:w="1368"/>
@@ -2727,9 +2639,6 @@
         </w:tc>
       </w:tr>
       <w:tr>
-        <w:trPr>
-          <w:cantSplit/>
-        </w:trPr>
         <w:tc>
           <w:tcPr>
             <w:tcW w:type="dxa" w:w="1368"/>
@@ -2825,9 +2734,6 @@
         </w:tc>
       </w:tr>
       <w:tr>
-        <w:trPr>
-          <w:cantSplit/>
-        </w:trPr>
         <w:tc>
           <w:tcPr>
             <w:tcW w:type="dxa" w:w="1368"/>
@@ -2923,9 +2829,6 @@
         </w:tc>
       </w:tr>
       <w:tr>
-        <w:trPr>
-          <w:cantSplit/>
-        </w:trPr>
         <w:tc>
           <w:tcPr>
             <w:tcW w:type="dxa" w:w="1368"/>
@@ -3021,9 +2924,6 @@
         </w:tc>
       </w:tr>
       <w:tr>
-        <w:trPr>
-          <w:cantSplit/>
-        </w:trPr>
         <w:tc>
           <w:tcPr>
             <w:tcW w:type="dxa" w:w="1368"/>
@@ -3119,9 +3019,6 @@
         </w:tc>
       </w:tr>
       <w:tr>
-        <w:trPr>
-          <w:cantSplit/>
-        </w:trPr>
         <w:tc>
           <w:tcPr>
             <w:tcW w:type="dxa" w:w="1368"/>
@@ -3217,9 +3114,6 @@
         </w:tc>
       </w:tr>
       <w:tr>
-        <w:trPr>
-          <w:cantSplit/>
-        </w:trPr>
         <w:tc>
           <w:tcPr>
             <w:tcW w:type="dxa" w:w="1368"/>
@@ -3331,10 +3225,6 @@
         <w:gridCol w:w="9144"/>
       </w:tblGrid>
       <w:tr>
-        <w:trPr>
-          <w:tblHeader w:val="true"/>
-          <w:cantSplit/>
-        </w:trPr>
         <w:tc>
           <w:tcPr>
             <w:tcW w:type="dxa" w:w="9936"/>
@@ -3389,10 +3279,6 @@
         <w:gridCol w:w="2484"/>
       </w:tblGrid>
       <w:tr>
-        <w:trPr>
-          <w:tblHeader w:val="true"/>
-          <w:cantSplit/>
-        </w:trPr>
         <w:tc>
           <w:tcPr>
             <w:tcW w:type="dxa" w:w="1368"/>
@@ -3499,9 +3385,6 @@
         </w:tc>
       </w:tr>
       <w:tr>
-        <w:trPr>
-          <w:cantSplit/>
-        </w:trPr>
         <w:tc>
           <w:tcPr>
             <w:tcW w:type="dxa" w:w="1368"/>
@@ -3597,9 +3480,6 @@
         </w:tc>
       </w:tr>
       <w:tr>
-        <w:trPr>
-          <w:cantSplit/>
-        </w:trPr>
         <w:tc>
           <w:tcPr>
             <w:tcW w:type="dxa" w:w="1368"/>
@@ -3695,9 +3575,6 @@
         </w:tc>
       </w:tr>
       <w:tr>
-        <w:trPr>
-          <w:cantSplit/>
-        </w:trPr>
         <w:tc>
           <w:tcPr>
             <w:tcW w:type="dxa" w:w="1368"/>
@@ -3793,9 +3670,6 @@
         </w:tc>
       </w:tr>
       <w:tr>
-        <w:trPr>
-          <w:cantSplit/>
-        </w:trPr>
         <w:tc>
           <w:tcPr>
             <w:tcW w:type="dxa" w:w="1368"/>
@@ -3891,9 +3765,6 @@
         </w:tc>
       </w:tr>
       <w:tr>
-        <w:trPr>
-          <w:cantSplit/>
-        </w:trPr>
         <w:tc>
           <w:tcPr>
             <w:tcW w:type="dxa" w:w="1368"/>
@@ -3989,9 +3860,6 @@
         </w:tc>
       </w:tr>
       <w:tr>
-        <w:trPr>
-          <w:cantSplit/>
-        </w:trPr>
         <w:tc>
           <w:tcPr>
             <w:tcW w:type="dxa" w:w="1368"/>
@@ -4115,10 +3983,6 @@
         <w:gridCol w:w="2484"/>
       </w:tblGrid>
       <w:tr>
-        <w:trPr>
-          <w:tblHeader w:val="true"/>
-          <w:cantSplit/>
-        </w:trPr>
         <w:tc>
           <w:tcPr>
             <w:tcW w:type="dxa" w:w="1368"/>
@@ -4225,9 +4089,6 @@
         </w:tc>
       </w:tr>
       <w:tr>
-        <w:trPr>
-          <w:cantSplit/>
-        </w:trPr>
         <w:tc>
           <w:tcPr>
             <w:tcW w:type="dxa" w:w="1368"/>
@@ -4323,9 +4184,6 @@
         </w:tc>
       </w:tr>
       <w:tr>
-        <w:trPr>
-          <w:cantSplit/>
-        </w:trPr>
         <w:tc>
           <w:tcPr>
             <w:tcW w:type="dxa" w:w="1368"/>
@@ -4421,9 +4279,6 @@
         </w:tc>
       </w:tr>
       <w:tr>
-        <w:trPr>
-          <w:cantSplit/>
-        </w:trPr>
         <w:tc>
           <w:tcPr>
             <w:tcW w:type="dxa" w:w="1368"/>
@@ -4552,10 +4407,6 @@
         <w:gridCol w:w="2484"/>
       </w:tblGrid>
       <w:tr>
-        <w:trPr>
-          <w:tblHeader w:val="true"/>
-          <w:cantSplit/>
-        </w:trPr>
         <w:tc>
           <w:tcPr>
             <w:tcW w:type="dxa" w:w="1368"/>
@@ -4662,9 +4513,6 @@
         </w:tc>
       </w:tr>
       <w:tr>
-        <w:trPr>
-          <w:cantSplit/>
-        </w:trPr>
         <w:tc>
           <w:tcPr>
             <w:tcW w:type="dxa" w:w="1368"/>
@@ -4760,9 +4608,6 @@
         </w:tc>
       </w:tr>
       <w:tr>
-        <w:trPr>
-          <w:cantSplit/>
-        </w:trPr>
         <w:tc>
           <w:tcPr>
             <w:tcW w:type="dxa" w:w="1368"/>
@@ -4858,9 +4703,6 @@
         </w:tc>
       </w:tr>
       <w:tr>
-        <w:trPr>
-          <w:cantSplit/>
-        </w:trPr>
         <w:tc>
           <w:tcPr>
             <w:tcW w:type="dxa" w:w="1368"/>
@@ -4956,9 +4798,6 @@
         </w:tc>
       </w:tr>
       <w:tr>
-        <w:trPr>
-          <w:cantSplit/>
-        </w:trPr>
         <w:tc>
           <w:tcPr>
             <w:tcW w:type="dxa" w:w="1368"/>
@@ -5054,9 +4893,6 @@
         </w:tc>
       </w:tr>
       <w:tr>
-        <w:trPr>
-          <w:cantSplit/>
-        </w:trPr>
         <w:tc>
           <w:tcPr>
             <w:tcW w:type="dxa" w:w="1368"/>
@@ -5152,9 +4988,6 @@
         </w:tc>
       </w:tr>
       <w:tr>
-        <w:trPr>
-          <w:cantSplit/>
-        </w:trPr>
         <w:tc>
           <w:tcPr>
             <w:tcW w:type="dxa" w:w="1368"/>
@@ -5250,9 +5083,6 @@
         </w:tc>
       </w:tr>
       <w:tr>
-        <w:trPr>
-          <w:cantSplit/>
-        </w:trPr>
         <w:tc>
           <w:tcPr>
             <w:tcW w:type="dxa" w:w="1368"/>
@@ -5348,9 +5178,6 @@
         </w:tc>
       </w:tr>
       <w:tr>
-        <w:trPr>
-          <w:cantSplit/>
-        </w:trPr>
         <w:tc>
           <w:tcPr>
             <w:tcW w:type="dxa" w:w="1368"/>
@@ -5666,10 +5493,6 @@
         <w:gridCol w:w="9144"/>
       </w:tblGrid>
       <w:tr>
-        <w:trPr>
-          <w:tblHeader w:val="true"/>
-          <w:cantSplit/>
-        </w:trPr>
         <w:tc>
           <w:tcPr>
             <w:tcW w:type="dxa" w:w="9936"/>
@@ -5724,10 +5547,6 @@
         <w:gridCol w:w="2484"/>
       </w:tblGrid>
       <w:tr>
-        <w:trPr>
-          <w:tblHeader w:val="true"/>
-          <w:cantSplit/>
-        </w:trPr>
         <w:tc>
           <w:tcPr>
             <w:tcW w:type="dxa" w:w="1368"/>
@@ -5834,9 +5653,6 @@
         </w:tc>
       </w:tr>
       <w:tr>
-        <w:trPr>
-          <w:cantSplit/>
-        </w:trPr>
         <w:tc>
           <w:tcPr>
             <w:tcW w:type="dxa" w:w="1368"/>
@@ -5932,9 +5748,6 @@
         </w:tc>
       </w:tr>
       <w:tr>
-        <w:trPr>
-          <w:cantSplit/>
-        </w:trPr>
         <w:tc>
           <w:tcPr>
             <w:tcW w:type="dxa" w:w="1368"/>
@@ -6030,9 +5843,6 @@
         </w:tc>
       </w:tr>
       <w:tr>
-        <w:trPr>
-          <w:cantSplit/>
-        </w:trPr>
         <w:tc>
           <w:tcPr>
             <w:tcW w:type="dxa" w:w="1368"/>
@@ -6128,9 +5938,6 @@
         </w:tc>
       </w:tr>
       <w:tr>
-        <w:trPr>
-          <w:cantSplit/>
-        </w:trPr>
         <w:tc>
           <w:tcPr>
             <w:tcW w:type="dxa" w:w="1368"/>
@@ -6226,9 +6033,6 @@
         </w:tc>
       </w:tr>
       <w:tr>
-        <w:trPr>
-          <w:cantSplit/>
-        </w:trPr>
         <w:tc>
           <w:tcPr>
             <w:tcW w:type="dxa" w:w="1368"/>
@@ -6324,9 +6128,6 @@
         </w:tc>
       </w:tr>
       <w:tr>
-        <w:trPr>
-          <w:cantSplit/>
-        </w:trPr>
         <w:tc>
           <w:tcPr>
             <w:tcW w:type="dxa" w:w="1368"/>
@@ -6422,9 +6223,6 @@
         </w:tc>
       </w:tr>
       <w:tr>
-        <w:trPr>
-          <w:cantSplit/>
-        </w:trPr>
         <w:tc>
           <w:tcPr>
             <w:tcW w:type="dxa" w:w="1368"/>
@@ -6548,10 +6346,6 @@
         <w:gridCol w:w="2484"/>
       </w:tblGrid>
       <w:tr>
-        <w:trPr>
-          <w:tblHeader w:val="true"/>
-          <w:cantSplit/>
-        </w:trPr>
         <w:tc>
           <w:tcPr>
             <w:tcW w:type="dxa" w:w="1368"/>
@@ -6658,9 +6452,6 @@
         </w:tc>
       </w:tr>
       <w:tr>
-        <w:trPr>
-          <w:cantSplit/>
-        </w:trPr>
         <w:tc>
           <w:tcPr>
             <w:tcW w:type="dxa" w:w="1368"/>
@@ -6756,9 +6547,6 @@
         </w:tc>
       </w:tr>
       <w:tr>
-        <w:trPr>
-          <w:cantSplit/>
-        </w:trPr>
         <w:tc>
           <w:tcPr>
             <w:tcW w:type="dxa" w:w="1368"/>
@@ -6854,9 +6642,6 @@
         </w:tc>
       </w:tr>
       <w:tr>
-        <w:trPr>
-          <w:cantSplit/>
-        </w:trPr>
         <w:tc>
           <w:tcPr>
             <w:tcW w:type="dxa" w:w="1368"/>
@@ -6952,9 +6737,6 @@
         </w:tc>
       </w:tr>
       <w:tr>
-        <w:trPr>
-          <w:cantSplit/>
-        </w:trPr>
         <w:tc>
           <w:tcPr>
             <w:tcW w:type="dxa" w:w="1368"/>
@@ -7050,9 +6832,6 @@
         </w:tc>
       </w:tr>
       <w:tr>
-        <w:trPr>
-          <w:cantSplit/>
-        </w:trPr>
         <w:tc>
           <w:tcPr>
             <w:tcW w:type="dxa" w:w="1368"/>
@@ -7213,10 +6992,6 @@
         <w:gridCol w:w="9144"/>
       </w:tblGrid>
       <w:tr>
-        <w:trPr>
-          <w:tblHeader w:val="true"/>
-          <w:cantSplit/>
-        </w:trPr>
         <w:tc>
           <w:tcPr>
             <w:tcW w:type="dxa" w:w="9936"/>
@@ -7316,10 +7091,6 @@
         <w:gridCol w:w="9144"/>
       </w:tblGrid>
       <w:tr>
-        <w:trPr>
-          <w:tblHeader w:val="true"/>
-          <w:cantSplit/>
-        </w:trPr>
         <w:tc>
           <w:tcPr>
             <w:tcW w:type="dxa" w:w="9936"/>
@@ -7362,7 +7133,7 @@
     </w:p>
     <w:p>
       <w:r>
-        <w:t>En este proceso Copilot se utilizó como escritor de código bajo instrucciones muy acotadas. El objetivo es que Copilot haga una transformación concreta, no que decida la arquitectura, ejecute comandos o mezcle tareas. Las plantillas siguientes están diseñadas para reutilizarse cambiando únicamente los campos entre corchetes.</w:t>
+        <w:t>Copilot se utiliza principalmente como escritor de código bajo instrucciones muy acotadas. Para documentación, correcciones pequeñas o cambios mecánicos claramente controlados, es preferible editar directamente si evita consumo innecesario de cuota. El objetivo es que Copilot haga una transformación concreta, no que decida la arquitectura, ejecute comandos o mezcle tareas. Después de cada uso, comprobar git status y git diff para confirmar que realmente modificó el workspace esperado.</w:t>
       </w:r>
     </w:p>
     <w:p>
@@ -8178,6 +7949,22 @@
     </w:p>
     <w:p>
       <w:pPr>
+        <w:pStyle w:val="ListBullet"/>
+      </w:pPr>
+      <w:r>
+        <w:t>Reservar Copilot para cambios de código con valor real; no consumir cuota en documentación que pueda editarse y revisar directamente.</w:t>
+      </w:r>
+    </w:p>
+    <w:p>
+      <w:pPr>
+        <w:pStyle w:val="ListBullet"/>
+      </w:pPr>
+      <w:r>
+        <w:t>Si Copilot no modifica archivos, no repetir prompts largos de forma indefinida: verificar primero el modo de edición/Agent y el workspace activo.</w:t>
+      </w:r>
+    </w:p>
+    <w:p>
+      <w:pPr>
         <w:pStyle w:val="Heading1"/>
         <w:keepNext/>
       </w:pPr>
@@ -8583,6 +8370,182 @@
       </w:r>
       <w:r>
         <w:t>git tag -a nombre-del-tag -m "Descripción del cierre"</w:t>
+      </w:r>
+    </w:p>
+    <w:p>
+      <w:pPr>
+        <w:pStyle w:val="Heading1"/>
+      </w:pPr>
+      <w:r>
+        <w:t>21. Validación visual de la aplicación web</w:t>
+      </w:r>
+    </w:p>
+    <w:p>
+      <w:pPr/>
+      <w:r>
+        <w:t>En cambios de plantillas Jinja/HTML, la prueba visual debe hacerse contra una única instancia recién iniciada. Una instancia antigua puede mantener en memoria templates anteriores y hacer que el navegador muestre un comportamiento que ya no corresponde a los archivos del workspace.</w:t>
+      </w:r>
+    </w:p>
+    <w:p>
+      <w:pPr>
+        <w:pStyle w:val="CodeBlock"/>
+      </w:pPr>
+      <w:r>
+        <w:t>netstat -ano | findstr :5000</w:t>
+      </w:r>
+    </w:p>
+    <w:p>
+      <w:pPr/>
+      <w:r>
+        <w:t>Comprobar las líneas LISTENING, identificar sus PID y detener instancias antiguas con Stop-Process -Id &lt;PID&gt; -Force. Después arrancar desde la rama/carpeta correcta con .\start_web.bat y realizar Ctrl+F5 en el navegador.</w:t>
+      </w:r>
+    </w:p>
+    <w:p>
+      <w:pPr>
+        <w:pStyle w:val="ListBullet"/>
+      </w:pPr>
+      <w:r>
+        <w:t>☐ Solo una instancia LISTENING en el puerto 5000.</w:t>
+      </w:r>
+    </w:p>
+    <w:p>
+      <w:pPr>
+        <w:pStyle w:val="ListBullet"/>
+      </w:pPr>
+      <w:r>
+        <w:t>☐ Rama y cwd confirmados antes de arrancar.</w:t>
+      </w:r>
+    </w:p>
+    <w:p>
+      <w:pPr>
+        <w:pStyle w:val="ListBullet"/>
+      </w:pPr>
+      <w:r>
+        <w:t>☐ Subpestañas de configuración muestran un único panel activo.</w:t>
+      </w:r>
+    </w:p>
+    <w:p>
+      <w:pPr>
+        <w:pStyle w:val="ListBullet"/>
+      </w:pPr>
+      <w:r>
+        <w:t>☐ Botones Ayuda abren y cierran el modal correspondiente.</w:t>
+      </w:r>
+    </w:p>
+    <w:p>
+      <w:pPr>
+        <w:pStyle w:val="ListBullet"/>
+      </w:pPr>
+      <w:r>
+        <w:t>☐ Tildes, eñes, símbolos e iconos se muestran correctamente.</w:t>
+      </w:r>
+    </w:p>
+    <w:p>
+      <w:pPr>
+        <w:pStyle w:val="Heading1"/>
+      </w:pPr>
+      <w:r>
+        <w:t>22. Documentación y ayuda contextual</w:t>
+      </w:r>
+    </w:p>
+    <w:p>
+      <w:pPr/>
+      <w:r>
+        <w:t>Las ayudas de configuración forman parte del comportamiento visible del producto y deben revisarse cuando cambie la lógica de un indicador. Actualmente Global, EMA, RSI, MACD, ATR, Estocástico, Bollinger y Volumen/MoS disponen de ayuda contextual.</w:t>
+      </w:r>
+    </w:p>
+    <w:p>
+      <w:pPr/>
+      <w:r>
+        <w:t>La documentación web se filtra por rol: el usuario normal accede a la documentación funcional permitida y el administrador puede consultar la documentación técnica completa. La autorización debe mantenerse también en backend.</w:t>
+      </w:r>
+    </w:p>
+    <w:p>
+      <w:pPr>
+        <w:pStyle w:val="Heading1"/>
+      </w:pPr>
+      <w:r>
+        <w:t>23. Definition of Done de cambios funcionales</w:t>
+      </w:r>
+    </w:p>
+    <w:p>
+      <w:pPr>
+        <w:pStyle w:val="ListBullet"/>
+      </w:pPr>
+      <w:r>
+        <w:t>☐ Código implementado.</w:t>
+      </w:r>
+    </w:p>
+    <w:p>
+      <w:pPr>
+        <w:pStyle w:val="ListBullet"/>
+      </w:pPr>
+      <w:r>
+        <w:t>☐ Tests añadidos o actualizados cuando proceda.</w:t>
+      </w:r>
+    </w:p>
+    <w:p>
+      <w:pPr>
+        <w:pStyle w:val="ListBullet"/>
+      </w:pPr>
+      <w:r>
+        <w:t>☐ Tests existentes superados.</w:t>
+      </w:r>
+    </w:p>
+    <w:p>
+      <w:pPr>
+        <w:pStyle w:val="ListBullet"/>
+      </w:pPr>
+      <w:r>
+        <w:t>☐ Ayuda contextual añadida o actualizada si existe interfaz.</w:t>
+      </w:r>
+    </w:p>
+    <w:p>
+      <w:pPr>
+        <w:pStyle w:val="ListBullet"/>
+      </w:pPr>
+      <w:r>
+        <w:t>☐ Manual de usuario actualizado.</w:t>
+      </w:r>
+    </w:p>
+    <w:p>
+      <w:pPr>
+        <w:pStyle w:val="ListBullet"/>
+      </w:pPr>
+      <w:r>
+        <w:t>☐ Documentación admin/técnica actualizada si procede.</w:t>
+      </w:r>
+    </w:p>
+    <w:p>
+      <w:pPr>
+        <w:pStyle w:val="ListBullet"/>
+      </w:pPr>
+      <w:r>
+        <w:t>☐ README actualizado si cambia arquitectura o navegación.</w:t>
+      </w:r>
+    </w:p>
+    <w:p>
+      <w:pPr>
+        <w:pStyle w:val="ListBullet"/>
+      </w:pPr>
+      <w:r>
+        <w:t>☐ Verificación funcional y visual realizada.</w:t>
+      </w:r>
+    </w:p>
+    <w:p>
+      <w:pPr>
+        <w:pStyle w:val="ListBullet"/>
+      </w:pPr>
+      <w:r>
+        <w:t>☐ Commit realizado con una única intención.</w:t>
+      </w:r>
+    </w:p>
+    <w:p>
+      <w:pPr>
+        <w:pStyle w:val="ListBullet"/>
+      </w:pPr>
+      <w:r>
+        <w:t>☐ Tag/checkpoint creado cuando corresponda.</w:t>
       </w:r>
     </w:p>
     <w:p>
@@ -8675,10 +8638,6 @@
         <w:gridCol w:w="3312"/>
       </w:tblGrid>
       <w:tr>
-        <w:trPr>
-          <w:tblHeader w:val="true"/>
-          <w:cantSplit/>
-        </w:trPr>
         <w:tc>
           <w:tcPr>
             <w:tcW w:type="dxa" w:w="2160"/>
@@ -8756,9 +8715,6 @@
         </w:tc>
       </w:tr>
       <w:tr>
-        <w:trPr>
-          <w:cantSplit/>
-        </w:trPr>
         <w:tc>
           <w:tcPr>
             <w:tcW w:type="dxa" w:w="2160"/>
@@ -8821,9 +8777,6 @@
         </w:tc>
       </w:tr>
       <w:tr>
-        <w:trPr>
-          <w:cantSplit/>
-        </w:trPr>
         <w:tc>
           <w:tcPr>
             <w:tcW w:type="dxa" w:w="2160"/>
@@ -8886,9 +8839,6 @@
         </w:tc>
       </w:tr>
       <w:tr>
-        <w:trPr>
-          <w:cantSplit/>
-        </w:trPr>
         <w:tc>
           <w:tcPr>
             <w:tcW w:type="dxa" w:w="2160"/>
@@ -8951,9 +8901,6 @@
         </w:tc>
       </w:tr>
       <w:tr>
-        <w:trPr>
-          <w:cantSplit/>
-        </w:trPr>
         <w:tc>
           <w:tcPr>
             <w:tcW w:type="dxa" w:w="2160"/>
@@ -9016,9 +8963,6 @@
         </w:tc>
       </w:tr>
       <w:tr>
-        <w:trPr>
-          <w:cantSplit/>
-        </w:trPr>
         <w:tc>
           <w:tcPr>
             <w:tcW w:type="dxa" w:w="2160"/>
@@ -9081,9 +9025,6 @@
         </w:tc>
       </w:tr>
       <w:tr>
-        <w:trPr>
-          <w:cantSplit/>
-        </w:trPr>
         <w:tc>
           <w:tcPr>
             <w:tcW w:type="dxa" w:w="2160"/>
@@ -9146,9 +9087,6 @@
         </w:tc>
       </w:tr>
       <w:tr>
-        <w:trPr>
-          <w:cantSplit/>
-        </w:trPr>
         <w:tc>
           <w:tcPr>
             <w:tcW w:type="dxa" w:w="2160"/>
@@ -9234,7 +9172,7 @@
         <w:color w:val="787878"/>
         <w:sz w:val="16"/>
       </w:rPr>
-      <w:t>Manual operativo TradingCore · 15/09/2026</w:t>
+      <w:t>Manual operativo TradingCore · 18/09/2026</w:t>
     </w:r>
   </w:p>
 </w:ftr>

</xml_diff>

<commit_message>
docs: consolidar auditoria de indicadores
</commit_message>
<xml_diff>
--- a/docs/Manual_operativo_TradingCore_PowerShell_Git_Copilot.docx
+++ b/docs/Manual_operativo_TradingCore_PowerShell_Git_Copilot.docx
@@ -49,7 +49,7 @@
         <w:jc w:val="center"/>
       </w:pPr>
       <w:r>
-        <w:t>Última actualización: 18/09/2026</w:t>
+        <w:t>Última actualización: 20/09/2026</w:t>
       </w:r>
     </w:p>
     <w:p>
@@ -7498,7 +7498,7 @@
     </w:p>
     <w:p>
       <w:r>
-        <w:t>Ejemplo aplicado: ampliar cobertura de señales EMA, RSI, MACD, Stochastic, ATR y Volume.</w:t>
+        <w:t>Ejemplo aplicado: ampliar cobertura de señales EMA, RSI, MACD, Stochastic, ATR, Bollinger, MoS y Volumen.</w:t>
       </w:r>
     </w:p>
     <w:p>
@@ -8457,7 +8457,7 @@
     <w:p>
       <w:pPr/>
       <w:r>
-        <w:t>La documentación web se filtra por rol: el usuario normal accede a la documentación funcional permitida y el administrador puede consultar la documentación técnica completa. La autorización debe mantenerse también en backend.</w:t>
+        <w:t>La documentación web se filtra por rol: el usuario normal accede únicamente al Manual de Usuario y a las ayudas contextuales de la interfaz; el administrador puede consultar toda la documentación técnica y operativa. La autorización se mantiene también en backend.</w:t>
       </w:r>
     </w:p>
     <w:p>
@@ -8548,6 +8548,86 @@
         <w:t>☐ Tag/checkpoint creado cuando corresponda.</w:t>
       </w:r>
     </w:p>
+    <w:p>
+      <w:pPr>
+        <w:pStyle w:val="Heading1"/>
+      </w:pPr>
+      <w:r>
+        <w:t>24. Estado validado de la auditoría de indicadores</w:t>
+      </w:r>
+    </w:p>
+    <w:p>
+      <w:r>
+        <w:t>A 20/09/2026 se ha completado la auditoría UI -&gt; configuración -&gt; motor de los indicadores principales. El objetivo de este checkpoint es que mantenimiento, tests y documentación describan el mismo contrato funcional.</w:t>
+      </w:r>
+    </w:p>
+    <w:p>
+      <w:pPr>
+        <w:pStyle w:val="ListBullet"/>
+      </w:pPr>
+      <w:r>
+        <w:t>Persistencia: corregidos booleanos de ATR, MoS mínimo y Volumen mínimo; stoploss_swing_enabled se renderiza de forma explícita.</w:t>
+      </w:r>
+    </w:p>
+    <w:p>
+      <w:pPr>
+        <w:pStyle w:val="ListBullet"/>
+      </w:pPr>
+      <w:r>
+        <w:t>MACD: cruce e histograma de compra/venta consumen directamente la opción elegida; None desactiva ese lado.</w:t>
+      </w:r>
+    </w:p>
+    <w:p>
+      <w:pPr>
+        <w:pStyle w:val="ListBullet"/>
+      </w:pPr>
+      <w:r>
+        <w:t>Stochastic: Fast/Mid/Slow consumen sus lógicas mínimo/ascendente y máximo/descendente; N/A no genera señal.</w:t>
+      </w:r>
+    </w:p>
+    <w:p>
+      <w:pPr>
+        <w:pStyle w:val="ListBullet"/>
+      </w:pPr>
+      <w:r>
+        <w:t>Bollinger: la compra requiere bb_buy_crossover activo y cruce alcista de la banda inferior; no existe compra alternativa por simple toque cuando está desactivado.</w:t>
+      </w:r>
+    </w:p>
+    <w:p>
+      <w:pPr>
+        <w:pStyle w:val="ListBullet"/>
+      </w:pPr>
+      <w:r>
+        <w:t>MoS: umbral, mínimo y ascendente se aplican con las confirmaciones activas en lógica AND.</w:t>
+      </w:r>
+    </w:p>
+    <w:p>
+      <w:pPr>
+        <w:pStyle w:val="ListBullet"/>
+      </w:pPr>
+      <w:r>
+        <w:t>Volumen: la referencia es una SMA de volumen; volume_ascendente representa la tendencia real de esa SMA y ya no un contador oculto de overshoots.</w:t>
+      </w:r>
+    </w:p>
+    <w:p>
+      <w:pPr>
+        <w:pStyle w:val="ListBullet"/>
+      </w:pPr>
+      <w:r>
+        <w:t>Validación del último bloque: 49 tests unitarios de señales y 42 tests web superados.</w:t>
+      </w:r>
+    </w:p>
+    <w:p>
+      <w:r>
+        <w:t>Commits de referencia: b933e2c (persistencia), 6ad2d9e (MACD), 5a79719 (Stochastic), 277a831 (Bollinger), da92dd7 (MoS) y 8809036 (Volumen).</w:t>
+      </w:r>
+    </w:p>
+    <w:p>
+      <w:r>
+        <w:t>Regla operativa: antes de cerrar un cambio de indicador, revisar conjuntamente plantilla UI, carga/persistencia, atributos de estrategia, consumidor del motor, tests, ayuda contextual, Manual de Usuario y documentación técnica.</w:t>
+      </w:r>
+    </w:p>
+    <w:p/>
     <w:p>
       <w:pPr>
         <w:pStyle w:val="Heading1"/>

</xml_diff>